<commit_message>
Revise government workflows, use Gmail only and add landmark setup
</commit_message>
<xml_diff>
--- a/public/packs/citizen-feedback/operations-reference.docx
+++ b/public/packs/citizen-feedback/operations-reference.docx
@@ -7,12 +7,14 @@
         <w:pStyle w:val="Title"/>
       </w:pPr>
       <w:r>
-        <w:t>Municipal operations reference</w:t>
+        <w:t>Operations reference</w:t>
       </w:r>
     </w:p>
     <w:p>
       <w:r>
-        <w:t>Use this reference to prepare the weekly estate review, classify feedback and keep the counts and follow-up actions traceable. Read the manager email for the decision required.</w:t>
+        <w:t>Estate improvement pilot · Reference date: 22 September 2026</w:t>
+        <w:br/>
+        <w:t>Fictional workshop assumptions for planning, not procurement quotations.</w:t>
       </w:r>
     </w:p>
     <w:p>
@@ -20,64 +22,12 @@
         <w:pStyle w:val="Heading1"/>
       </w:pPr>
       <w:r>
-        <w:t>Municipal coordination review</w:t>
-      </w:r>
-    </w:p>
-    <w:p>
-      <w:pPr>
-        <w:pStyle w:val="Heading2"/>
-      </w:pPr>
-      <w:r>
-        <w:t>Role and decision</w:t>
+        <w:t>Decision and working boundaries</w:t>
       </w:r>
     </w:p>
     <w:p>
       <w:r>
-        <w:t>You are a municipal coordination desk preparing a short brief for a Director (Municipal Coordination). Review records dated 1–22 September 2026 from Bedok, Tampines, Jurong West, Toa Payoh, Woodlands and Punggol. </w:t>
-      </w:r>
-    </w:p>
-    <w:p>
-      <w:r>
-        <w:t>The director can sponsor three small improvement initiatives. Consider repeat incidents, unresolved access concerns, evidence quality and whether a process change is practical. Do not invent weights or costs; show your proposed criteria before ranking.</w:t>
-      </w:r>
-    </w:p>
-    <w:p>
-      <w:pPr>
-        <w:pStyle w:val="Heading2"/>
-      </w:pPr>
-      <w:r>
-        <w:t>Responsibilities</w:t>
-      </w:r>
-    </w:p>
-    <w:p>
-      <w:r>
-        <w:t>The coordination desk checks evidence and coordinates follow-up. A estate liaison verifies Town Council or agency asset responsibility. A operations lead proposes an action.  No official response-time SLA is provided.</w:t>
-      </w:r>
-    </w:p>
-    <w:p>
-      <w:pPr>
-        <w:pStyle w:val="Heading2"/>
-      </w:pPr>
-      <w:r>
-        <w:t>Measurement</w:t>
-      </w:r>
-    </w:p>
-    <w:p>
-      <w:r>
-        <w:t>Count unique report_id for submissions and case_id for incidents. Case_updates is the status source for incident-level totals. Resolve conflicting entries for review. Report resolution duration only for valid resolved dates; missing and impossible dates are not zero days. The reference date is 22 September 2026. Findings describe this sample only.</w:t>
-      </w:r>
-    </w:p>
-    <w:p>
-      <w:pPr>
-        <w:pStyle w:val="Heading2"/>
-      </w:pPr>
-      <w:r>
-        <w:t>Brief format</w:t>
-      </w:r>
-    </w:p>
-    <w:p>
-      <w:r>
-        <w:t>Decision requested; evidence; three proposed actions; responsible role to confirm; open questions. Use Singapore English, SGD where needed, and day-month-year dates.</w:t>
+        <w:t>Recommend three priorities across six towns for the 29 September review. The S$60,000 pilot envelope is provisional. No works or spending are approved. Check asset ownership and the responsible Agency or Town Council before routing a case. Do not infer jurisdiction from the photograph or town alone.</w:t>
       </w:r>
     </w:p>
     <w:p>
@@ -85,552 +35,55 @@
         <w:pStyle w:val="Heading1"/>
       </w:pPr>
       <w:r>
-        <w:t>Municipal feedback categories</w:t>
+        <w:t>People and milestones</w:t>
       </w:r>
     </w:p>
     <w:p>
+      <w:pPr>
+        <w:pStyle w:val="ListBullet"/>
+      </w:pPr>
       <w:r>
-        <w:t>Issue categories for the coordination team.</w:t>
+        <w:t>Asha, team lead: consolidate the proposal and seek the senior director’s decision after the review.</w:t>
       </w:r>
     </w:p>
-    <w:tbl>
-      <w:tblPr>
-        <w:tblW w:type="auto" w:w="0"/>
-        <w:tblLayout w:type="fixed"/>
-        <w:tblLook w:firstColumn="1" w:firstRow="1" w:lastColumn="0" w:lastRow="0" w:noHBand="0" w:noVBand="1" w:val="04A0"/>
-      </w:tblPr>
-      <w:tblGrid>
-        <w:gridCol w:w="3216"/>
-        <w:gridCol w:w="3216"/>
-        <w:gridCol w:w="3216"/>
-      </w:tblGrid>
-      <w:tr>
-        <w:trPr>
-          <w:cantSplit/>
-          <w:tblHeader/>
-        </w:trPr>
-        <w:tc>
-          <w:tcPr>
-            <w:tcW w:type="dxa" w:w="3216"/>
-            <w:tcBorders>
-              <w:top w:val="single" w:sz="4" w:color="D9D9D9"/>
-              <w:left w:val="single" w:sz="4" w:color="D9D9D9"/>
-              <w:bottom w:val="single" w:sz="4" w:color="D9D9D9"/>
-              <w:right w:val="single" w:sz="4" w:color="D9D9D9"/>
-            </w:tcBorders>
-            <w:shd w:fill="E8ECEF"/>
-          </w:tcPr>
-          <w:p>
-            <w:pPr>
-              <w:spacing w:after="100" w:before="100"/>
-            </w:pPr>
-            <w:r>
-              <w:rPr>
-                <w:b/>
-                <w:sz w:val="18"/>
-              </w:rPr>
-              <w:t>Category</w:t>
-            </w:r>
-          </w:p>
-        </w:tc>
-        <w:tc>
-          <w:tcPr>
-            <w:tcW w:type="dxa" w:w="3216"/>
-            <w:tcBorders>
-              <w:top w:val="single" w:sz="4" w:color="D9D9D9"/>
-              <w:left w:val="single" w:sz="4" w:color="D9D9D9"/>
-              <w:bottom w:val="single" w:sz="4" w:color="D9D9D9"/>
-              <w:right w:val="single" w:sz="4" w:color="D9D9D9"/>
-            </w:tcBorders>
-            <w:shd w:fill="E8ECEF"/>
-          </w:tcPr>
-          <w:p>
-            <w:pPr>
-              <w:spacing w:after="100" w:before="100"/>
-            </w:pPr>
-            <w:r>
-              <w:rPr>
-                <w:b/>
-                <w:sz w:val="18"/>
-              </w:rPr>
-              <w:t>Include</w:t>
-            </w:r>
-          </w:p>
-        </w:tc>
-        <w:tc>
-          <w:tcPr>
-            <w:tcW w:type="dxa" w:w="3216"/>
-            <w:tcBorders>
-              <w:top w:val="single" w:sz="4" w:color="D9D9D9"/>
-              <w:left w:val="single" w:sz="4" w:color="D9D9D9"/>
-              <w:bottom w:val="single" w:sz="4" w:color="D9D9D9"/>
-              <w:right w:val="single" w:sz="4" w:color="D9D9D9"/>
-            </w:tcBorders>
-            <w:shd w:fill="E8ECEF"/>
-          </w:tcPr>
-          <w:p>
-            <w:pPr>
-              <w:spacing w:after="100" w:before="100"/>
-            </w:pPr>
-            <w:r>
-              <w:rPr>
-                <w:b/>
-                <w:sz w:val="18"/>
-              </w:rPr>
-              <w:t>Review boundary</w:t>
-            </w:r>
-          </w:p>
-        </w:tc>
-      </w:tr>
-      <w:tr>
-        <w:trPr>
-          <w:cantSplit/>
-        </w:trPr>
-        <w:tc>
-          <w:tcPr>
-            <w:tcW w:type="dxa" w:w="3216"/>
-            <w:tcBorders>
-              <w:top w:val="single" w:sz="4" w:color="D9D9D9"/>
-              <w:left w:val="single" w:sz="4" w:color="D9D9D9"/>
-              <w:bottom w:val="single" w:sz="4" w:color="D9D9D9"/>
-              <w:right w:val="single" w:sz="4" w:color="D9D9D9"/>
-            </w:tcBorders>
-          </w:tcPr>
-          <w:p>
-            <w:pPr>
-              <w:spacing w:after="100" w:before="100"/>
-            </w:pPr>
-            <w:r>
-              <w:rPr>
-                <w:b w:val="0"/>
-                <w:sz w:val="18"/>
-              </w:rPr>
-              <w:t>Lighting</w:t>
-            </w:r>
-          </w:p>
-        </w:tc>
-        <w:tc>
-          <w:tcPr>
-            <w:tcW w:type="dxa" w:w="3216"/>
-            <w:tcBorders>
-              <w:top w:val="single" w:sz="4" w:color="D9D9D9"/>
-              <w:left w:val="single" w:sz="4" w:color="D9D9D9"/>
-              <w:bottom w:val="single" w:sz="4" w:color="D9D9D9"/>
-              <w:right w:val="single" w:sz="4" w:color="D9D9D9"/>
-            </w:tcBorders>
-          </w:tcPr>
-          <w:p>
-            <w:pPr>
-              <w:spacing w:after="100" w:before="100"/>
-            </w:pPr>
-            <w:r>
-              <w:rPr>
-                <w:b w:val="0"/>
-                <w:sz w:val="18"/>
-              </w:rPr>
-              <w:t>Faulty or inadequate lighting in common spaces</w:t>
-            </w:r>
-          </w:p>
-        </w:tc>
-        <w:tc>
-          <w:tcPr>
-            <w:tcW w:type="dxa" w:w="3216"/>
-            <w:tcBorders>
-              <w:top w:val="single" w:sz="4" w:color="D9D9D9"/>
-              <w:left w:val="single" w:sz="4" w:color="D9D9D9"/>
-              <w:bottom w:val="single" w:sz="4" w:color="D9D9D9"/>
-              <w:right w:val="single" w:sz="4" w:color="D9D9D9"/>
-            </w:tcBorders>
-          </w:tcPr>
-          <w:p>
-            <w:pPr>
-              <w:spacing w:after="100" w:before="100"/>
-            </w:pPr>
-            <w:r>
-              <w:rPr>
-                <w:b w:val="0"/>
-                <w:sz w:val="18"/>
-              </w:rPr>
-              <w:t>Confirm the asset owner; do not assume all lights belong to a Town Council.</w:t>
-            </w:r>
-          </w:p>
-        </w:tc>
-      </w:tr>
-      <w:tr>
-        <w:trPr>
-          <w:cantSplit/>
-        </w:trPr>
-        <w:tc>
-          <w:tcPr>
-            <w:tcW w:type="dxa" w:w="3216"/>
-            <w:tcBorders>
-              <w:top w:val="single" w:sz="4" w:color="D9D9D9"/>
-              <w:left w:val="single" w:sz="4" w:color="D9D9D9"/>
-              <w:bottom w:val="single" w:sz="4" w:color="D9D9D9"/>
-              <w:right w:val="single" w:sz="4" w:color="D9D9D9"/>
-            </w:tcBorders>
-          </w:tcPr>
-          <w:p>
-            <w:pPr>
-              <w:spacing w:after="100" w:before="100"/>
-            </w:pPr>
-            <w:r>
-              <w:rPr>
-                <w:b w:val="0"/>
-                <w:sz w:val="18"/>
-              </w:rPr>
-              <w:t>Cleanliness</w:t>
-            </w:r>
-          </w:p>
-        </w:tc>
-        <w:tc>
-          <w:tcPr>
-            <w:tcW w:type="dxa" w:w="3216"/>
-            <w:tcBorders>
-              <w:top w:val="single" w:sz="4" w:color="D9D9D9"/>
-              <w:left w:val="single" w:sz="4" w:color="D9D9D9"/>
-              <w:bottom w:val="single" w:sz="4" w:color="D9D9D9"/>
-              <w:right w:val="single" w:sz="4" w:color="D9D9D9"/>
-            </w:tcBorders>
-          </w:tcPr>
-          <w:p>
-            <w:pPr>
-              <w:spacing w:after="100" w:before="100"/>
-            </w:pPr>
-            <w:r>
-              <w:rPr>
-                <w:b w:val="0"/>
-                <w:sz w:val="18"/>
-              </w:rPr>
-              <w:t>Litter, overflowing bins, recurring dirty common spaces</w:t>
-            </w:r>
-          </w:p>
-        </w:tc>
-        <w:tc>
-          <w:tcPr>
-            <w:tcW w:type="dxa" w:w="3216"/>
-            <w:tcBorders>
-              <w:top w:val="single" w:sz="4" w:color="D9D9D9"/>
-              <w:left w:val="single" w:sz="4" w:color="D9D9D9"/>
-              <w:bottom w:val="single" w:sz="4" w:color="D9D9D9"/>
-              <w:right w:val="single" w:sz="4" w:color="D9D9D9"/>
-            </w:tcBorders>
-          </w:tcPr>
-          <w:p>
-            <w:pPr>
-              <w:spacing w:after="100" w:before="100"/>
-            </w:pPr>
-            <w:r>
-              <w:rPr>
-                <w:b w:val="0"/>
-                <w:sz w:val="18"/>
-              </w:rPr>
-              <w:t>Distinguish one missed clearance from a recurring pattern.</w:t>
-            </w:r>
-          </w:p>
-        </w:tc>
-      </w:tr>
-      <w:tr>
-        <w:trPr>
-          <w:cantSplit/>
-        </w:trPr>
-        <w:tc>
-          <w:tcPr>
-            <w:tcW w:type="dxa" w:w="3216"/>
-            <w:tcBorders>
-              <w:top w:val="single" w:sz="4" w:color="D9D9D9"/>
-              <w:left w:val="single" w:sz="4" w:color="D9D9D9"/>
-              <w:bottom w:val="single" w:sz="4" w:color="D9D9D9"/>
-              <w:right w:val="single" w:sz="4" w:color="D9D9D9"/>
-            </w:tcBorders>
-          </w:tcPr>
-          <w:p>
-            <w:pPr>
-              <w:spacing w:after="100" w:before="100"/>
-            </w:pPr>
-            <w:r>
-              <w:rPr>
-                <w:b w:val="0"/>
-                <w:sz w:val="18"/>
-              </w:rPr>
-              <w:t>Walkway access</w:t>
-            </w:r>
-          </w:p>
-        </w:tc>
-        <w:tc>
-          <w:tcPr>
-            <w:tcW w:type="dxa" w:w="3216"/>
-            <w:tcBorders>
-              <w:top w:val="single" w:sz="4" w:color="D9D9D9"/>
-              <w:left w:val="single" w:sz="4" w:color="D9D9D9"/>
-              <w:bottom w:val="single" w:sz="4" w:color="D9D9D9"/>
-              <w:right w:val="single" w:sz="4" w:color="D9D9D9"/>
-            </w:tcBorders>
-          </w:tcPr>
-          <w:p>
-            <w:pPr>
-              <w:spacing w:after="100" w:before="100"/>
-            </w:pPr>
-            <w:r>
-              <w:rPr>
-                <w:b w:val="0"/>
-                <w:sz w:val="18"/>
-              </w:rPr>
-              <w:t>Obstructions, damaged surfaces, ramps and accessibility</w:t>
-            </w:r>
-          </w:p>
-        </w:tc>
-        <w:tc>
-          <w:tcPr>
-            <w:tcW w:type="dxa" w:w="3216"/>
-            <w:tcBorders>
-              <w:top w:val="single" w:sz="4" w:color="D9D9D9"/>
-              <w:left w:val="single" w:sz="4" w:color="D9D9D9"/>
-              <w:bottom w:val="single" w:sz="4" w:color="D9D9D9"/>
-              <w:right w:val="single" w:sz="4" w:color="D9D9D9"/>
-            </w:tcBorders>
-          </w:tcPr>
-          <w:p>
-            <w:pPr>
-              <w:spacing w:after="100" w:before="100"/>
-            </w:pPr>
-            <w:r>
-              <w:rPr>
-                <w:b w:val="0"/>
-                <w:sz w:val="18"/>
-              </w:rPr>
-              <w:t>Preserve potentially urgent access concerns for officer review.</w:t>
-            </w:r>
-          </w:p>
-        </w:tc>
-      </w:tr>
-      <w:tr>
-        <w:trPr>
-          <w:cantSplit/>
-        </w:trPr>
-        <w:tc>
-          <w:tcPr>
-            <w:tcW w:type="dxa" w:w="3216"/>
-            <w:tcBorders>
-              <w:top w:val="single" w:sz="4" w:color="D9D9D9"/>
-              <w:left w:val="single" w:sz="4" w:color="D9D9D9"/>
-              <w:bottom w:val="single" w:sz="4" w:color="D9D9D9"/>
-              <w:right w:val="single" w:sz="4" w:color="D9D9D9"/>
-            </w:tcBorders>
-          </w:tcPr>
-          <w:p>
-            <w:pPr>
-              <w:spacing w:after="100" w:before="100"/>
-            </w:pPr>
-            <w:r>
-              <w:rPr>
-                <w:b w:val="0"/>
-                <w:sz w:val="18"/>
-              </w:rPr>
-              <w:t>Drainage</w:t>
-            </w:r>
-          </w:p>
-        </w:tc>
-        <w:tc>
-          <w:tcPr>
-            <w:tcW w:type="dxa" w:w="3216"/>
-            <w:tcBorders>
-              <w:top w:val="single" w:sz="4" w:color="D9D9D9"/>
-              <w:left w:val="single" w:sz="4" w:color="D9D9D9"/>
-              <w:bottom w:val="single" w:sz="4" w:color="D9D9D9"/>
-              <w:right w:val="single" w:sz="4" w:color="D9D9D9"/>
-            </w:tcBorders>
-          </w:tcPr>
-          <w:p>
-            <w:pPr>
-              <w:spacing w:after="100" w:before="100"/>
-            </w:pPr>
-            <w:r>
-              <w:rPr>
-                <w:b w:val="0"/>
-                <w:sz w:val="18"/>
-              </w:rPr>
-              <w:t>Ponding, blocked gratings and reported drainage concerns</w:t>
-            </w:r>
-          </w:p>
-        </w:tc>
-        <w:tc>
-          <w:tcPr>
-            <w:tcW w:type="dxa" w:w="3216"/>
-            <w:tcBorders>
-              <w:top w:val="single" w:sz="4" w:color="D9D9D9"/>
-              <w:left w:val="single" w:sz="4" w:color="D9D9D9"/>
-              <w:bottom w:val="single" w:sz="4" w:color="D9D9D9"/>
-              <w:right w:val="single" w:sz="4" w:color="D9D9D9"/>
-            </w:tcBorders>
-          </w:tcPr>
-          <w:p>
-            <w:pPr>
-              <w:spacing w:after="100" w:before="100"/>
-            </w:pPr>
-            <w:r>
-              <w:rPr>
-                <w:b w:val="0"/>
-                <w:sz w:val="18"/>
-              </w:rPr>
-              <w:t>A resident report alone does not establish flood risk.</w:t>
-            </w:r>
-          </w:p>
-        </w:tc>
-      </w:tr>
-      <w:tr>
-        <w:trPr>
-          <w:cantSplit/>
-        </w:trPr>
-        <w:tc>
-          <w:tcPr>
-            <w:tcW w:type="dxa" w:w="3216"/>
-            <w:tcBorders>
-              <w:top w:val="single" w:sz="4" w:color="D9D9D9"/>
-              <w:left w:val="single" w:sz="4" w:color="D9D9D9"/>
-              <w:bottom w:val="single" w:sz="4" w:color="D9D9D9"/>
-              <w:right w:val="single" w:sz="4" w:color="D9D9D9"/>
-            </w:tcBorders>
-          </w:tcPr>
-          <w:p>
-            <w:pPr>
-              <w:spacing w:after="100" w:before="100"/>
-            </w:pPr>
-            <w:r>
-              <w:rPr>
-                <w:b w:val="0"/>
-                <w:sz w:val="18"/>
-              </w:rPr>
-              <w:t>Greenery</w:t>
-            </w:r>
-          </w:p>
-        </w:tc>
-        <w:tc>
-          <w:tcPr>
-            <w:tcW w:type="dxa" w:w="3216"/>
-            <w:tcBorders>
-              <w:top w:val="single" w:sz="4" w:color="D9D9D9"/>
-              <w:left w:val="single" w:sz="4" w:color="D9D9D9"/>
-              <w:bottom w:val="single" w:sz="4" w:color="D9D9D9"/>
-              <w:right w:val="single" w:sz="4" w:color="D9D9D9"/>
-            </w:tcBorders>
-          </w:tcPr>
-          <w:p>
-            <w:pPr>
-              <w:spacing w:after="100" w:before="100"/>
-            </w:pPr>
-            <w:r>
-              <w:rPr>
-                <w:b w:val="0"/>
-                <w:sz w:val="18"/>
-              </w:rPr>
-              <w:t>Overhanging branches, hedges and leaf accumulation</w:t>
-            </w:r>
-          </w:p>
-        </w:tc>
-        <w:tc>
-          <w:tcPr>
-            <w:tcW w:type="dxa" w:w="3216"/>
-            <w:tcBorders>
-              <w:top w:val="single" w:sz="4" w:color="D9D9D9"/>
-              <w:left w:val="single" w:sz="4" w:color="D9D9D9"/>
-              <w:bottom w:val="single" w:sz="4" w:color="D9D9D9"/>
-              <w:right w:val="single" w:sz="4" w:color="D9D9D9"/>
-            </w:tcBorders>
-          </w:tcPr>
-          <w:p>
-            <w:pPr>
-              <w:spacing w:after="100" w:before="100"/>
-            </w:pPr>
-            <w:r>
-              <w:rPr>
-                <w:b w:val="0"/>
-                <w:sz w:val="18"/>
-              </w:rPr>
-              <w:t>Ownership and maintenance responsibility require confirmation.</w:t>
-            </w:r>
-          </w:p>
-        </w:tc>
-      </w:tr>
-      <w:tr>
-        <w:trPr>
-          <w:cantSplit/>
-        </w:trPr>
-        <w:tc>
-          <w:tcPr>
-            <w:tcW w:type="dxa" w:w="3216"/>
-            <w:tcBorders>
-              <w:top w:val="single" w:sz="4" w:color="D9D9D9"/>
-              <w:left w:val="single" w:sz="4" w:color="D9D9D9"/>
-              <w:bottom w:val="single" w:sz="4" w:color="D9D9D9"/>
-              <w:right w:val="single" w:sz="4" w:color="D9D9D9"/>
-            </w:tcBorders>
-          </w:tcPr>
-          <w:p>
-            <w:pPr>
-              <w:spacing w:after="100" w:before="100"/>
-            </w:pPr>
-            <w:r>
-              <w:rPr>
-                <w:b w:val="0"/>
-                <w:sz w:val="18"/>
-              </w:rPr>
-              <w:t>Noise</w:t>
-            </w:r>
-          </w:p>
-        </w:tc>
-        <w:tc>
-          <w:tcPr>
-            <w:tcW w:type="dxa" w:w="3216"/>
-            <w:tcBorders>
-              <w:top w:val="single" w:sz="4" w:color="D9D9D9"/>
-              <w:left w:val="single" w:sz="4" w:color="D9D9D9"/>
-              <w:bottom w:val="single" w:sz="4" w:color="D9D9D9"/>
-              <w:right w:val="single" w:sz="4" w:color="D9D9D9"/>
-            </w:tcBorders>
-          </w:tcPr>
-          <w:p>
-            <w:pPr>
-              <w:spacing w:after="100" w:before="100"/>
-            </w:pPr>
-            <w:r>
-              <w:rPr>
-                <w:b w:val="0"/>
-                <w:sz w:val="18"/>
-              </w:rPr>
-              <w:t>Repeated noise or unclear common-space use</w:t>
-            </w:r>
-          </w:p>
-        </w:tc>
-        <w:tc>
-          <w:tcPr>
-            <w:tcW w:type="dxa" w:w="3216"/>
-            <w:tcBorders>
-              <w:top w:val="single" w:sz="4" w:color="D9D9D9"/>
-              <w:left w:val="single" w:sz="4" w:color="D9D9D9"/>
-              <w:bottom w:val="single" w:sz="4" w:color="D9D9D9"/>
-              <w:right w:val="single" w:sz="4" w:color="D9D9D9"/>
-            </w:tcBorders>
-          </w:tcPr>
-          <w:p>
-            <w:pPr>
-              <w:spacing w:after="100" w:before="100"/>
-            </w:pPr>
-            <w:r>
-              <w:rPr>
-                <w:b w:val="0"/>
-                <w:sz w:val="18"/>
-              </w:rPr>
-              <w:t>Do not identify or accuse a resident. Clarify source and timing.</w:t>
-            </w:r>
-          </w:p>
-        </w:tc>
-      </w:tr>
-    </w:tbl>
-    <w:p/>
     <w:p>
+      <w:pPr>
+        <w:pStyle w:val="ListBullet"/>
+      </w:pPr>
       <w:r>
-        <w:t>Allow multiple tags. If evidence is unclear, record Needs review rather than force a category. Counts by tag may exceed total reports. Cite report IDs behind every theme.</w:t>
+        <w:t>Mei, operations: coordinate C001 inspection by 26 September; confirm ownership and technical constraints.</w:t>
+      </w:r>
+    </w:p>
+    <w:p>
+      <w:pPr>
+        <w:pStyle w:val="ListBullet"/>
+      </w:pPr>
+      <w:r>
+        <w:t>Farah, resident liaison: assemble inspection questions by 25 September.</w:t>
+      </w:r>
+    </w:p>
+    <w:p>
+      <w:pPr>
+        <w:pStyle w:val="ListBullet"/>
+      </w:pPr>
+      <w:r>
+        <w:t>Daniel, analyst: deliver the historical analysis and revised priorities by 29 September.</w:t>
+      </w:r>
+    </w:p>
+    <w:p>
+      <w:pPr>
+        <w:pStyle w:val="ListBullet"/>
+      </w:pPr>
+      <w:r>
+        <w:t>Ravi, finance: review cost ranges and shared costs by 29 September.</w:t>
+      </w:r>
+    </w:p>
+    <w:p>
+      <w:pPr>
+        <w:pStyle w:val="ListBullet"/>
+      </w:pPr>
+      <w:r>
+        <w:t>Senior director: receives the summary and decides on the proposal. Select the actual recipient in the participant’s email account; no source address is authorised for sending.</w:t>
       </w:r>
     </w:p>
     <w:p>
@@ -638,20 +91,12 @@
         <w:pStyle w:val="Heading1"/>
       </w:pPr>
       <w:r>
-        <w:t>Singapore reference</w:t>
+        <w:t>How to compare options</w:t>
       </w:r>
     </w:p>
     <w:p>
       <w:r>
-        <w:t>OneService offers digital channels for residents to report neighbourhood issues. Its public page also describes other estate-related services. Use the source records for this review.</w:t>
-      </w:r>
-    </w:p>
-    <w:p>
-      <w:pPr>
-        <w:pStyle w:val="ListBullet"/>
-      </w:pPr>
-      <w:r>
-        <w:t>OneService App and Chatbot (https://www.oneservice.gov.sg/oneservice/oneservice-app-and-chatbot/) – checked 22 September 2026.</w:t>
+        <w:t>Use safety/access severity, persistence, distinct-case recurrence, feasibility, delivery time and cost. State the weighting and show how rankings change if weights change. Unknown severity or cost remains unknown. A proposal can be high priority but still require inspection before implementation.</w:t>
       </w:r>
     </w:p>
     <w:p>
@@ -659,12 +104,17 @@
         <w:pStyle w:val="Heading1"/>
       </w:pPr>
       <w:r>
-        <w:t>Photo evidence handling</w:t>
+        <w:t>Interpreting the image</w:t>
       </w:r>
     </w:p>
     <w:p>
       <w:r>
-        <w:t>The image file is paired with R001 and C001. Record visible features, the resident claim, and open verification questions separately. The photograph does not establish duration, wiring condition, statutory compliance or asset ownership. Do not count it as a second incident.</w:t>
+        <w:t>site-photo-R001.png is linked only to R001/C001. Separate what is visible (a level change, wet surface, path and lighting fixtures) from resident claims and proposed changes. Retain the original photograph. Annotate a generated copy with callouts and a legend; do not depict a completed repair as evidence.</w:t>
+      </w:r>
+    </w:p>
+    <w:p>
+      <w:r>
+        <w:br w:type="page"/>
       </w:r>
     </w:p>
     <w:p>
@@ -672,186 +122,323 @@
         <w:pStyle w:val="Heading1"/>
       </w:pPr>
       <w:r>
-        <w:t>Weekly email instructions</w:t>
+        <w:t>Planning cost ranges</w:t>
       </w:r>
     </w:p>
     <w:p>
       <w:r>
-        <w:t>Prepare one concise coordination digest per reporting period for reviewer@example.invalid. Include the three priorities, source record IDs and decisions requested. Keep a tracker of the period, draft date and review status. Repeating the same period should flag the existing draft. Suggested routine: Monday at 9 am Singapore time.</w:t>
+        <w:t>SGD per C001-sized intervention, including tax, excluding contingency. Ranges are illustrative planning inputs. Choose quantities explicitly. Lead times start after approval and depend on ownership and technical checks.</w:t>
       </w:r>
     </w:p>
     <w:tbl>
       <w:tblPr>
+        <w:tblStyle w:val="LightShading-Accent1"/>
         <w:tblW w:type="auto" w:w="0"/>
-        <w:tblLayout w:type="fixed"/>
         <w:tblLook w:firstColumn="1" w:firstRow="1" w:lastColumn="0" w:lastRow="0" w:noHBand="0" w:noVBand="1" w:val="04A0"/>
       </w:tblPr>
       <w:tblGrid>
-        <w:gridCol w:w="2592"/>
-        <w:gridCol w:w="7056"/>
+        <w:gridCol w:w="3312"/>
+        <w:gridCol w:w="3312"/>
+        <w:gridCol w:w="3312"/>
       </w:tblGrid>
       <w:tr>
-        <w:trPr>
-          <w:cantSplit/>
-          <w:tblHeader/>
-        </w:trPr>
         <w:tc>
           <w:tcPr>
-            <w:tcW w:type="dxa" w:w="2592"/>
-            <w:tcBorders>
-              <w:top w:val="single" w:sz="4" w:color="D9D9D9"/>
-              <w:left w:val="single" w:sz="4" w:color="D9D9D9"/>
-              <w:bottom w:val="single" w:sz="4" w:color="D9D9D9"/>
-              <w:right w:val="single" w:sz="4" w:color="D9D9D9"/>
-            </w:tcBorders>
-            <w:shd w:fill="E8ECEF"/>
+            <w:tcW w:type="dxa" w:w="3312"/>
           </w:tcPr>
           <w:p>
-            <w:pPr>
-              <w:spacing w:after="100" w:before="100"/>
-            </w:pPr>
             <w:r>
-              <w:rPr>
-                <w:b/>
-                <w:sz w:val="18"/>
-              </w:rPr>
-              <w:t>role</w:t>
+              <w:t>Option</w:t>
             </w:r>
           </w:p>
         </w:tc>
         <w:tc>
           <w:tcPr>
-            <w:tcW w:type="dxa" w:w="7056"/>
-            <w:tcBorders>
-              <w:top w:val="single" w:sz="4" w:color="D9D9D9"/>
-              <w:left w:val="single" w:sz="4" w:color="D9D9D9"/>
-              <w:bottom w:val="single" w:sz="4" w:color="D9D9D9"/>
-              <w:right w:val="single" w:sz="4" w:color="D9D9D9"/>
-            </w:tcBorders>
-            <w:shd w:fill="E8ECEF"/>
+            <w:tcW w:type="dxa" w:w="3312"/>
           </w:tcPr>
           <w:p>
-            <w:pPr>
-              <w:spacing w:after="100" w:before="100"/>
-            </w:pPr>
             <w:r>
-              <w:rPr>
-                <w:b/>
-                <w:sz w:val="18"/>
-              </w:rPr>
-              <w:t>email</w:t>
+              <w:t>Base range (S$)</w:t>
+            </w:r>
+          </w:p>
+        </w:tc>
+        <w:tc>
+          <w:tcPr>
+            <w:tcW w:type="dxa" w:w="3312"/>
+          </w:tcPr>
+          <w:p>
+            <w:r>
+              <w:t>Feasibility / indicative time</w:t>
             </w:r>
           </w:p>
         </w:tc>
       </w:tr>
       <w:tr>
-        <w:trPr>
-          <w:cantSplit/>
-        </w:trPr>
         <w:tc>
           <w:tcPr>
-            <w:tcW w:type="dxa" w:w="2592"/>
-            <w:tcBorders>
-              <w:top w:val="single" w:sz="4" w:color="D9D9D9"/>
-              <w:left w:val="single" w:sz="4" w:color="D9D9D9"/>
-              <w:bottom w:val="single" w:sz="4" w:color="D9D9D9"/>
-              <w:right w:val="single" w:sz="4" w:color="D9D9D9"/>
-            </w:tcBorders>
+            <w:tcW w:type="dxa" w:w="3312"/>
           </w:tcPr>
           <w:p>
-            <w:pPr>
-              <w:spacing w:after="100" w:before="100"/>
-            </w:pPr>
             <w:r>
-              <w:rPr>
-                <w:b w:val="0"/>
-                <w:sz w:val="18"/>
-              </w:rPr>
-              <w:t>workshop_reviewer</w:t>
+              <w:t>Access, drainage and lighting survey (one combined site visit)</w:t>
             </w:r>
           </w:p>
         </w:tc>
         <w:tc>
           <w:tcPr>
-            <w:tcW w:type="dxa" w:w="7056"/>
-            <w:tcBorders>
-              <w:top w:val="single" w:sz="4" w:color="D9D9D9"/>
-              <w:left w:val="single" w:sz="4" w:color="D9D9D9"/>
-              <w:bottom w:val="single" w:sz="4" w:color="D9D9D9"/>
-              <w:right w:val="single" w:sz="4" w:color="D9D9D9"/>
-            </w:tcBorders>
+            <w:tcW w:type="dxa" w:w="3312"/>
           </w:tcPr>
           <w:p>
-            <w:pPr>
-              <w:spacing w:after="100" w:before="100"/>
-            </w:pPr>
             <w:r>
-              <w:rPr>
-                <w:b w:val="0"/>
-                <w:sz w:val="18"/>
-              </w:rPr>
-              <w:t>reviewer@example.invalid</w:t>
+              <w:t>800–1,500</w:t>
+            </w:r>
+          </w:p>
+        </w:tc>
+        <w:tc>
+          <w:tcPr>
+            <w:tcW w:type="dxa" w:w="3312"/>
+          </w:tcPr>
+          <w:p>
+            <w:r>
+              <w:t>High; 1 week; confirm access and asset owner</w:t>
             </w:r>
           </w:p>
         </w:tc>
       </w:tr>
       <w:tr>
-        <w:trPr>
-          <w:cantSplit/>
-        </w:trPr>
         <w:tc>
           <w:tcPr>
-            <w:tcW w:type="dxa" w:w="2592"/>
-            <w:tcBorders>
-              <w:top w:val="single" w:sz="4" w:color="D9D9D9"/>
-              <w:left w:val="single" w:sz="4" w:color="D9D9D9"/>
-              <w:bottom w:val="single" w:sz="4" w:color="D9D9D9"/>
-              <w:right w:val="single" w:sz="4" w:color="D9D9D9"/>
-            </w:tcBorders>
+            <w:tcW w:type="dxa" w:w="3312"/>
           </w:tcPr>
           <w:p>
-            <w:pPr>
-              <w:spacing w:after="100" w:before="100"/>
-            </w:pPr>
             <w:r>
-              <w:rPr>
-                <w:b w:val="0"/>
-                <w:sz w:val="18"/>
-              </w:rPr>
-              <w:t>workshop_organiser</w:t>
+              <w:t>Step-edge contrast and anti-slip treatment (one small zone)</w:t>
             </w:r>
           </w:p>
         </w:tc>
         <w:tc>
           <w:tcPr>
-            <w:tcW w:type="dxa" w:w="7056"/>
-            <w:tcBorders>
-              <w:top w:val="single" w:sz="4" w:color="D9D9D9"/>
-              <w:left w:val="single" w:sz="4" w:color="D9D9D9"/>
-              <w:bottom w:val="single" w:sz="4" w:color="D9D9D9"/>
-              <w:right w:val="single" w:sz="4" w:color="D9D9D9"/>
-            </w:tcBorders>
+            <w:tcW w:type="dxa" w:w="3312"/>
           </w:tcPr>
           <w:p>
-            <w:pPr>
-              <w:spacing w:after="100" w:before="100"/>
-            </w:pPr>
             <w:r>
-              <w:rPr>
-                <w:b w:val="0"/>
-                <w:sz w:val="18"/>
-              </w:rPr>
-              <w:t>organiser@example.invalid</w:t>
+              <w:t>1,500–3,000</w:t>
+            </w:r>
+          </w:p>
+        </w:tc>
+        <w:tc>
+          <w:tcPr>
+            <w:tcW w:type="dxa" w:w="3312"/>
+          </w:tcPr>
+          <w:p>
+            <w:r>
+              <w:t>Medium; 1–2 weeks; grip/material assessment</w:t>
+            </w:r>
+          </w:p>
+        </w:tc>
+      </w:tr>
+      <w:tr>
+        <w:tc>
+          <w:tcPr>
+            <w:tcW w:type="dxa" w:w="3312"/>
+          </w:tcPr>
+          <w:p>
+            <w:r>
+              <w:t>Drain inspection and clearance (one inlet)</w:t>
+            </w:r>
+          </w:p>
+        </w:tc>
+        <w:tc>
+          <w:tcPr>
+            <w:tcW w:type="dxa" w:w="3312"/>
+          </w:tcPr>
+          <w:p>
+            <w:r>
+              <w:t>1,000–2,500</w:t>
+            </w:r>
+          </w:p>
+        </w:tc>
+        <w:tc>
+          <w:tcPr>
+            <w:tcW w:type="dxa" w:w="3312"/>
+          </w:tcPr>
+          <w:p>
+            <w:r>
+              <w:t>High; 1–2 weeks; repair/regrading excluded</w:t>
+            </w:r>
+          </w:p>
+        </w:tc>
+      </w:tr>
+      <w:tr>
+        <w:tc>
+          <w:tcPr>
+            <w:tcW w:type="dxa" w:w="3312"/>
+          </w:tcPr>
+          <w:p>
+            <w:r>
+              <w:t>Lighting test and minor fixture repair (up to two fixtures)</w:t>
+            </w:r>
+          </w:p>
+        </w:tc>
+        <w:tc>
+          <w:tcPr>
+            <w:tcW w:type="dxa" w:w="3312"/>
+          </w:tcPr>
+          <w:p>
+            <w:r>
+              <w:t>1,200–3,000</w:t>
+            </w:r>
+          </w:p>
+        </w:tc>
+        <w:tc>
+          <w:tcPr>
+            <w:tcW w:type="dxa" w:w="3312"/>
+          </w:tcPr>
+          <w:p>
+            <w:r>
+              <w:t>Medium; 1–3 weeks; electrical checks</w:t>
+            </w:r>
+          </w:p>
+        </w:tc>
+      </w:tr>
+      <w:tr>
+        <w:tc>
+          <w:tcPr>
+            <w:tcW w:type="dxa" w:w="3312"/>
+          </w:tcPr>
+          <w:p>
+            <w:r>
+              <w:t>Step-free ramp (one short connection)</w:t>
+            </w:r>
+          </w:p>
+        </w:tc>
+        <w:tc>
+          <w:tcPr>
+            <w:tcW w:type="dxa" w:w="3312"/>
+          </w:tcPr>
+          <w:p>
+            <w:r>
+              <w:t>10,000–18,000</w:t>
+            </w:r>
+          </w:p>
+        </w:tc>
+        <w:tc>
+          <w:tcPr>
+            <w:tcW w:type="dxa" w:w="3312"/>
+          </w:tcPr>
+          <w:p>
+            <w:r>
+              <w:t>Requires site checks; 4–8 weeks; gradient, services and permissions</w:t>
+            </w:r>
+          </w:p>
+        </w:tc>
+      </w:tr>
+      <w:tr>
+        <w:tc>
+          <w:tcPr>
+            <w:tcW w:type="dxa" w:w="3312"/>
+          </w:tcPr>
+          <w:p>
+            <w:r>
+              <w:t>Shared mobilisation (once for works at one site)</w:t>
+            </w:r>
+          </w:p>
+        </w:tc>
+        <w:tc>
+          <w:tcPr>
+            <w:tcW w:type="dxa" w:w="3312"/>
+          </w:tcPr>
+          <w:p>
+            <w:r>
+              <w:t>1,000–2,000</w:t>
+            </w:r>
+          </w:p>
+        </w:tc>
+        <w:tc>
+          <w:tcPr>
+            <w:tcW w:type="dxa" w:w="3312"/>
+          </w:tcPr>
+          <w:p>
+            <w:r>
+              <w:t>Add once across a combined works package</w:t>
             </w:r>
           </w:p>
         </w:tc>
       </w:tr>
     </w:tbl>
-    <w:p/>
+    <w:p>
+      <w:r>
+        <w:t>Budget method: sum chosen quantities at low/high unit ranges, add shared mobilisation once where works are proposed, then apply 15% contingency once to each combined base total. Show both the base range and contingency separately. Surveys alone do not require works mobilisation. A ramp and surface treatment may overlap; confirm scope before combining them.</w:t>
+      </w:r>
+    </w:p>
+    <w:p>
+      <w:r>
+        <w:t>Compare proposals with historical case estimates and actual costs separately. Existing case costs are evidence of past work and recorded needs; do not add them to a new proposal unless the scope genuinely includes those same interventions. Explain exclusions, unknown quantities and any package above S$60,000.</w:t>
+      </w:r>
+    </w:p>
+    <w:p>
+      <w:r>
+        <w:br w:type="page"/>
+      </w:r>
+    </w:p>
+    <w:p>
+      <w:pPr>
+        <w:pStyle w:val="Heading1"/>
+      </w:pPr>
+      <w:r>
+        <w:t>Data and daily updates</w:t>
+      </w:r>
+    </w:p>
+    <w:p>
+      <w:r>
+        <w:t>citizen_feedback.xlsx is a 22 September snapshot. Cases has one record per case; Reports contains contacts and repeated imports. Preserve original IDs, deduplicate exact repeated report IDs, review conflicting versions, validate dates and document missing values. Join comments without duplicating the case-level cost totals.</w:t>
+      </w:r>
+    </w:p>
+    <w:p>
+      <w:r>
+        <w:t>Use the narrative fields to inspect sub-topics within broad categories. For example, reports about Lighting may concern a dark section, intermittent flicker or shadows. A generated summary must cite the selected source report/case IDs, distinguish claims from verified findings and not invent counts.</w:t>
+      </w:r>
+    </w:p>
+    <w:p>
+      <w:pPr>
+        <w:pStyle w:val="Heading1"/>
+      </w:pPr>
+      <w:r>
+        <w:t>Daily summary rehearsal</w:t>
+      </w:r>
+    </w:p>
+    <w:p>
+      <w:r>
+        <w:t>daily_email_updates.xlsx supplies Messages, Processed and Read_me. Start with the existing processed-message ledger. Deduplicate by message_id, retain new replies within a thread, exclude unrelated messages and flag new issues lacking a case reference. Re-run the same batch to confirm no duplicate actions or summaries.</w:t>
+      </w:r>
+    </w:p>
+    <w:p>
+      <w:r>
+        <w:t>For a live daily task, first select the actual mailbox label/folder or sender/subject scope, initial lookback and timezone. Use 09:00 Asia/Singapore if no other preference is given. Save a schedule only when the integration and durable state support it. Show a first-run result, the saved schedule and how to stop it. Report limitations honestly.</w:t>
+      </w:r>
+    </w:p>
+    <w:p>
+      <w:pPr>
+        <w:pStyle w:val="Heading1"/>
+      </w:pPr>
+      <w:r>
+        <w:t>Communicating status</w:t>
+      </w:r>
+    </w:p>
+    <w:p>
+      <w:r>
+        <w:t>The leadership email should be brief: purpose, key points, agreed decisions, proposed priorities and cost range, material risks, next actions and the decision requested. Confirm the actual recipient and review the exact email before sending. Record whether it was sent or only drafted.</w:t>
+      </w:r>
+    </w:p>
+    <w:p>
+      <w:r>
+        <w:t>The final project site is a colleague-facing status page. Include an as-of timestamp, evidence snapshot date, proposal version, action owners/dates and confirmed status. Use reviewed summaries; omit raw mailbox bodies and credentials. If the site is a snapshot, label it clearly and explain how to refresh it. Do not claim live synchronisation unless implemented and tested.</w:t>
+      </w:r>
+    </w:p>
     <w:sectPr>
       <w:footerReference w:type="default" r:id="rId9"/>
-      <w:pgSz w:w="11909" w:h="16834"/>
-      <w:pgMar w:top="936" w:right="1123" w:bottom="936" w:left="1123" w:header="720" w:footer="720" w:gutter="0"/>
+      <w:pgSz w:w="12240" w:h="15840"/>
+      <w:pgMar w:top="1008" w:right="1152" w:bottom="1008" w:left="1152" w:header="720" w:footer="720" w:gutter="0"/>
       <w:cols w:space="720"/>
       <w:docGrid w:linePitch="360"/>
     </w:sectPr>
@@ -866,11 +453,9 @@
       <w:pStyle w:val="Footer"/>
     </w:pPr>
     <w:r>
-      <w:rPr>
-        <w:sz w:val="16"/>
-      </w:rPr>
-      <w:t>Reference material</w:t>
+      <w:t xml:space="preserve">Estate improvement review  •  </w:t>
     </w:r>
+    <w:fldSimple w:instr="PAGE"/>
   </w:p>
 </w:ftr>
 </file>
@@ -1239,12 +824,11 @@
     <w:qFormat/>
     <w:rsid w:val="00FC693F"/>
     <w:pPr>
-      <w:spacing w:after="120"/>
+      <w:spacing w:after="140"/>
     </w:pPr>
     <w:rPr>
-      <w:rFonts w:ascii="Arial" w:hAnsi="Arial"/>
-      <w:color w:val="000000"/>
-      <w:sz w:val="20"/>
+      <w:rFonts w:ascii="Calibri" w:hAnsi="Calibri"/>
+      <w:sz w:val="22"/>
     </w:rPr>
   </w:style>
   <w:style w:type="paragraph" w:styleId="Header">
@@ -1306,11 +890,11 @@
       <w:outlineLvl w:val="0"/>
     </w:pPr>
     <w:rPr>
-      <w:rFonts w:asciiTheme="majorHAnsi" w:eastAsiaTheme="majorEastAsia" w:hAnsiTheme="majorHAnsi" w:cstheme="majorBidi" w:ascii="Arial" w:hAnsi="Arial"/>
+      <w:rFonts w:asciiTheme="majorHAnsi" w:eastAsiaTheme="majorEastAsia" w:hAnsiTheme="majorHAnsi" w:cstheme="majorBidi"/>
       <w:b/>
       <w:bCs/>
       <w:color w:val="000000"/>
-      <w:sz w:val="30"/>
+      <w:sz w:val="28"/>
       <w:szCs w:val="28"/>
     </w:rPr>
   </w:style>
@@ -1330,11 +914,11 @@
       <w:outlineLvl w:val="1"/>
     </w:pPr>
     <w:rPr>
-      <w:rFonts w:asciiTheme="majorHAnsi" w:eastAsiaTheme="majorEastAsia" w:hAnsiTheme="majorHAnsi" w:cstheme="majorBidi" w:ascii="Arial" w:hAnsi="Arial"/>
+      <w:rFonts w:asciiTheme="majorHAnsi" w:eastAsiaTheme="majorEastAsia" w:hAnsiTheme="majorHAnsi" w:cstheme="majorBidi"/>
       <w:b/>
       <w:bCs/>
       <w:color w:val="000000"/>
-      <w:sz w:val="24"/>
+      <w:sz w:val="26"/>
       <w:szCs w:val="26"/>
     </w:rPr>
   </w:style>
@@ -1354,11 +938,10 @@
       <w:outlineLvl w:val="2"/>
     </w:pPr>
     <w:rPr>
-      <w:rFonts w:asciiTheme="majorHAnsi" w:eastAsiaTheme="majorEastAsia" w:hAnsiTheme="majorHAnsi" w:cstheme="majorBidi" w:ascii="Arial" w:hAnsi="Arial"/>
+      <w:rFonts w:asciiTheme="majorHAnsi" w:eastAsiaTheme="majorEastAsia" w:hAnsiTheme="majorHAnsi" w:cstheme="majorBidi"/>
       <w:b/>
       <w:bCs/>
-      <w:color w:val="000000"/>
-      <w:sz w:val="22"/>
+      <w:color w:val="4F81BD" w:themeColor="accent1"/>
     </w:rPr>
   </w:style>
   <w:style w:type="paragraph" w:styleId="Heading4">
@@ -1593,11 +1176,11 @@
       <w:contextualSpacing/>
     </w:pPr>
     <w:rPr>
-      <w:rFonts w:asciiTheme="majorHAnsi" w:eastAsiaTheme="majorEastAsia" w:hAnsiTheme="majorHAnsi" w:cstheme="majorBidi" w:ascii="Arial" w:hAnsi="Arial"/>
+      <w:rFonts w:asciiTheme="majorHAnsi" w:eastAsiaTheme="majorEastAsia" w:hAnsiTheme="majorHAnsi" w:cstheme="majorBidi"/>
       <w:color w:val="000000"/>
       <w:spacing w:val="5"/>
       <w:kern w:val="28"/>
-      <w:sz w:val="48"/>
+      <w:sz w:val="52"/>
       <w:szCs w:val="52"/>
     </w:rPr>
   </w:style>

</xml_diff>